<commit_message>
docs(manual): replace screenshots with captures from the running system
All 11 figures captured from the application with sample data; figure 10 caption updated; manual version 1.2.

Refs: R-01..R-08
</commit_message>
<xml_diff>
--- a/docs/คู่มือระบบยืม-คืนหนังสือ.docx
+++ b/docs/คู่มือระบบยืม-คืนหนังสือ.docx
@@ -107,7 +107,7 @@
           <w:szCs w:val="34"/>
           <w:cs/>
         </w:rPr>
-        <w:t>เวอร์ชันเอกสาร 1.1</w:t>
+        <w:t>เวอร์ชันเอกสาร 1.2</w:t>
       </w:r>
     </w:p>
     <w:p>
@@ -385,10 +385,7 @@
       </w:pPr>
       <w:r>
         <w:lastRenderedPageBreak/>
-        <w:t xml:space="preserve">1. </w:t>
-      </w:r>
-      <w:r>
-        <w:t>ภาพรวมระบบ</w:t>
+        <w:t>1. ภาพรวมระบบ</w:t>
       </w:r>
     </w:p>
     <w:p>
@@ -427,10 +424,7 @@
         <w:pStyle w:val="2"/>
       </w:pPr>
       <w:r>
-        <w:t xml:space="preserve">1.1 </w:t>
-      </w:r>
-      <w:r>
-        <w:t>กฎการยืมของระบบ</w:t>
+        <w:t>1.1 กฎการยืมของระบบ</w:t>
       </w:r>
     </w:p>
     <w:tbl>
@@ -766,10 +760,7 @@
         <w:pStyle w:val="2"/>
       </w:pPr>
       <w:r>
-        <w:t xml:space="preserve">1.2 </w:t>
-      </w:r>
-      <w:r>
-        <w:t>การเข้าใช้งาน</w:t>
+        <w:t>1.2 การเข้าใช้งาน</w:t>
       </w:r>
     </w:p>
     <w:p>
@@ -894,10 +885,7 @@
         <w:pStyle w:val="2"/>
       </w:pPr>
       <w:r>
-        <w:t xml:space="preserve">1.3 </w:t>
-      </w:r>
-      <w:r>
-        <w:t>เมนูหลัก</w:t>
+        <w:t>1.3 เมนูหลัก</w:t>
       </w:r>
     </w:p>
     <w:p>
@@ -1462,10 +1450,10 @@
           <w:noProof/>
         </w:rPr>
         <w:drawing>
-          <wp:inline distT="0" distB="0" distL="0" distR="0" wp14:anchorId="0F50A5C2" wp14:editId="23F3BF7F">
-            <wp:extent cx="5334000" cy="295275"/>
-            <wp:effectExtent l="0" t="0" r="0" b="0"/>
-            <wp:docPr id="1" name="nav.png" descr="แถบเมนูหลักด้านบนของระบบ" title="แถบเมนูหลักด้านบนของระบบ"/>
+          <wp:inline distT="0" distB="0" distL="0" distR="0" wp14:anchorId="0D8FD71D" wp14:editId="3422642A">
+            <wp:extent cx="5334000" cy="225156"/>
+            <wp:effectExtent l="19050" t="19050" r="19050" b="22860"/>
+            <wp:docPr id="1106148051" name="รูปภาพ 11"/>
             <wp:cNvGraphicFramePr>
               <a:graphicFrameLocks xmlns:a="http://schemas.openxmlformats.org/drawingml/2006/main" noChangeAspect="1"/>
             </wp:cNvGraphicFramePr>
@@ -1473,26 +1461,34 @@
               <a:graphicData uri="http://schemas.openxmlformats.org/drawingml/2006/picture">
                 <pic:pic xmlns:pic="http://schemas.openxmlformats.org/drawingml/2006/picture">
                   <pic:nvPicPr>
-                    <pic:cNvPr id="0" name=""/>
-                    <pic:cNvPicPr>
-                      <a:picLocks noChangeAspect="1" noChangeArrowheads="1"/>
-                    </pic:cNvPicPr>
+                    <pic:cNvPr id="1106148051" name=""/>
+                    <pic:cNvPicPr/>
                   </pic:nvPicPr>
                   <pic:blipFill>
-                    <a:blip r:embed="rId7"/>
-                    <a:srcRect/>
+                    <a:blip r:embed="rId7">
+                      <a:extLst>
+                        <a:ext uri="{28A0092B-C50C-407E-A947-70E740481C1C}">
+                          <a14:useLocalDpi xmlns:a14="http://schemas.microsoft.com/office/drawing/2010/main" val="0"/>
+                        </a:ext>
+                      </a:extLst>
+                    </a:blip>
                     <a:stretch>
                       <a:fillRect/>
                     </a:stretch>
                   </pic:blipFill>
-                  <pic:spPr bwMode="auto">
+                  <pic:spPr>
                     <a:xfrm>
                       <a:off x="0" y="0"/>
-                      <a:ext cx="5334000" cy="295275"/>
+                      <a:ext cx="5334000" cy="225156"/>
                     </a:xfrm>
                     <a:prstGeom prst="rect">
                       <a:avLst/>
                     </a:prstGeom>
+                    <a:ln w="9525">
+                      <a:solidFill>
+                        <a:srgbClr val="C9D1DA"/>
+                      </a:solidFill>
+                    </a:ln>
                   </pic:spPr>
                 </pic:pic>
               </a:graphicData>
@@ -1520,10 +1516,7 @@
         <w:pStyle w:val="1"/>
       </w:pPr>
       <w:r>
-        <w:t xml:space="preserve">2. </w:t>
-      </w:r>
-      <w:r>
-        <w:t>แดชบอร์ด</w:t>
+        <w:t>2. แดชบอร์ด</w:t>
       </w:r>
     </w:p>
     <w:p>
@@ -1859,10 +1852,7 @@
         <w:spacing w:after="120"/>
       </w:pPr>
       <w:r>
-        <w:t xml:space="preserve">ปุ่มทางลัด: "ยืมหนังสือ", "คืนหนังสือ" และ "ค้นหาหนังสือ" </w:t>
-      </w:r>
-      <w:r>
-        <w:t>ใช้ไปยังหน้าที่เกี่ยวข้องได้ทันที</w:t>
+        <w:t>ปุ่มทางลัด: "ยืมหนังสือ", "คืนหนังสือ" และ "ค้นหาหนังสือ" ใช้ไปยังหน้าที่เกี่ยวข้องได้ทันที</w:t>
       </w:r>
     </w:p>
     <w:p>
@@ -1876,10 +1866,10 @@
           <w:noProof/>
         </w:rPr>
         <w:drawing>
-          <wp:inline distT="0" distB="0" distL="0" distR="0" wp14:anchorId="59063191" wp14:editId="5DA87DFC">
-            <wp:extent cx="5334000" cy="1924050"/>
-            <wp:effectExtent l="0" t="0" r="0" b="0"/>
-            <wp:docPr id="2" name="dash.png" descr="หน้าแดชบอร์ด" title="หน้าแดชบอร์ด"/>
+          <wp:inline distT="0" distB="0" distL="0" distR="0" wp14:anchorId="44137983" wp14:editId="6FA97C51">
+            <wp:extent cx="5334000" cy="1795926"/>
+            <wp:effectExtent l="19050" t="19050" r="19050" b="13970"/>
+            <wp:docPr id="1612608034" name="รูปภาพ 10"/>
             <wp:cNvGraphicFramePr>
               <a:graphicFrameLocks xmlns:a="http://schemas.openxmlformats.org/drawingml/2006/main" noChangeAspect="1"/>
             </wp:cNvGraphicFramePr>
@@ -1887,26 +1877,34 @@
               <a:graphicData uri="http://schemas.openxmlformats.org/drawingml/2006/picture">
                 <pic:pic xmlns:pic="http://schemas.openxmlformats.org/drawingml/2006/picture">
                   <pic:nvPicPr>
-                    <pic:cNvPr id="0" name=""/>
-                    <pic:cNvPicPr>
-                      <a:picLocks noChangeAspect="1" noChangeArrowheads="1"/>
-                    </pic:cNvPicPr>
+                    <pic:cNvPr id="1612608034" name=""/>
+                    <pic:cNvPicPr/>
                   </pic:nvPicPr>
                   <pic:blipFill>
-                    <a:blip r:embed="rId8"/>
-                    <a:srcRect/>
+                    <a:blip r:embed="rId8">
+                      <a:extLst>
+                        <a:ext uri="{28A0092B-C50C-407E-A947-70E740481C1C}">
+                          <a14:useLocalDpi xmlns:a14="http://schemas.microsoft.com/office/drawing/2010/main" val="0"/>
+                        </a:ext>
+                      </a:extLst>
+                    </a:blip>
                     <a:stretch>
                       <a:fillRect/>
                     </a:stretch>
                   </pic:blipFill>
-                  <pic:spPr bwMode="auto">
+                  <pic:spPr>
                     <a:xfrm>
                       <a:off x="0" y="0"/>
-                      <a:ext cx="5334000" cy="1924050"/>
+                      <a:ext cx="5334000" cy="1795926"/>
                     </a:xfrm>
                     <a:prstGeom prst="rect">
                       <a:avLst/>
                     </a:prstGeom>
+                    <a:ln w="9525">
+                      <a:solidFill>
+                        <a:srgbClr val="C9D1DA"/>
+                      </a:solidFill>
+                    </a:ln>
                   </pic:spPr>
                 </pic:pic>
               </a:graphicData>
@@ -1934,10 +1932,7 @@
         <w:pStyle w:val="1"/>
       </w:pPr>
       <w:r>
-        <w:t xml:space="preserve">3. </w:t>
-      </w:r>
-      <w:r>
-        <w:t>การจัดการหมวดหมู่</w:t>
+        <w:t>3. การจัดการหมวดหมู่</w:t>
       </w:r>
     </w:p>
     <w:p>
@@ -1959,10 +1954,10 @@
           <w:noProof/>
         </w:rPr>
         <w:drawing>
-          <wp:inline distT="0" distB="0" distL="0" distR="0" wp14:anchorId="23F6257C" wp14:editId="3508BFF8">
-            <wp:extent cx="5334000" cy="2781300"/>
-            <wp:effectExtent l="0" t="0" r="0" b="0"/>
-            <wp:docPr id="3" name="cats.png" descr="หน้าจัดการหมวดหมู่หนังสือ" title="หน้าจัดการหมวดหมู่หนังสือ"/>
+          <wp:inline distT="0" distB="0" distL="0" distR="0" wp14:anchorId="0F923F64" wp14:editId="23434300">
+            <wp:extent cx="5334000" cy="2441844"/>
+            <wp:effectExtent l="19050" t="19050" r="19050" b="15875"/>
+            <wp:docPr id="917330706" name="รูปภาพ 9"/>
             <wp:cNvGraphicFramePr>
               <a:graphicFrameLocks xmlns:a="http://schemas.openxmlformats.org/drawingml/2006/main" noChangeAspect="1"/>
             </wp:cNvGraphicFramePr>
@@ -1970,26 +1965,34 @@
               <a:graphicData uri="http://schemas.openxmlformats.org/drawingml/2006/picture">
                 <pic:pic xmlns:pic="http://schemas.openxmlformats.org/drawingml/2006/picture">
                   <pic:nvPicPr>
-                    <pic:cNvPr id="0" name=""/>
-                    <pic:cNvPicPr>
-                      <a:picLocks noChangeAspect="1" noChangeArrowheads="1"/>
-                    </pic:cNvPicPr>
+                    <pic:cNvPr id="917330706" name=""/>
+                    <pic:cNvPicPr/>
                   </pic:nvPicPr>
                   <pic:blipFill>
-                    <a:blip r:embed="rId9"/>
-                    <a:srcRect/>
+                    <a:blip r:embed="rId9">
+                      <a:extLst>
+                        <a:ext uri="{28A0092B-C50C-407E-A947-70E740481C1C}">
+                          <a14:useLocalDpi xmlns:a14="http://schemas.microsoft.com/office/drawing/2010/main" val="0"/>
+                        </a:ext>
+                      </a:extLst>
+                    </a:blip>
                     <a:stretch>
                       <a:fillRect/>
                     </a:stretch>
                   </pic:blipFill>
-                  <pic:spPr bwMode="auto">
+                  <pic:spPr>
                     <a:xfrm>
                       <a:off x="0" y="0"/>
-                      <a:ext cx="5334000" cy="2781300"/>
+                      <a:ext cx="5334000" cy="2441844"/>
                     </a:xfrm>
                     <a:prstGeom prst="rect">
                       <a:avLst/>
                     </a:prstGeom>
+                    <a:ln w="9525">
+                      <a:solidFill>
+                        <a:srgbClr val="C9D1DA"/>
+                      </a:solidFill>
+                    </a:ln>
                   </pic:spPr>
                 </pic:pic>
               </a:graphicData>
@@ -2017,10 +2020,7 @@
         <w:pStyle w:val="2"/>
       </w:pPr>
       <w:r>
-        <w:t xml:space="preserve">3.1 </w:t>
-      </w:r>
-      <w:r>
-        <w:t>เพิ่มหมวดหมู่</w:t>
+        <w:t>3.1 เพิ่มหมวดหมู่</w:t>
       </w:r>
     </w:p>
     <w:p>
@@ -2072,10 +2072,7 @@
         <w:pStyle w:val="2"/>
       </w:pPr>
       <w:r>
-        <w:t xml:space="preserve">3.2 </w:t>
-      </w:r>
-      <w:r>
-        <w:t>แก้ไขชื่อหมวดหมู่</w:t>
+        <w:t>3.2 แก้ไขชื่อหมวดหมู่</w:t>
       </w:r>
     </w:p>
     <w:p>
@@ -2114,10 +2111,7 @@
         <w:pStyle w:val="2"/>
       </w:pPr>
       <w:r>
-        <w:t xml:space="preserve">3.3 </w:t>
-      </w:r>
-      <w:r>
-        <w:t>ลบหมวดหมู่</w:t>
+        <w:t>3.3 ลบหมวดหมู่</w:t>
       </w:r>
     </w:p>
     <w:p>
@@ -2137,10 +2131,7 @@
         <w:pStyle w:val="1"/>
       </w:pPr>
       <w:r>
-        <w:t xml:space="preserve">4. </w:t>
-      </w:r>
-      <w:r>
-        <w:t>การจัดการหนังสือ</w:t>
+        <w:t>4. การจัดการหนังสือ</w:t>
       </w:r>
     </w:p>
     <w:p>
@@ -2148,10 +2139,7 @@
         <w:pStyle w:val="2"/>
       </w:pPr>
       <w:r>
-        <w:t xml:space="preserve">4.1 </w:t>
-      </w:r>
-      <w:r>
-        <w:t>ค้นหาหนังสือ</w:t>
+        <w:t>4.1 ค้นหาหนังสือ</w:t>
       </w:r>
     </w:p>
     <w:p>
@@ -2230,10 +2218,10 @@
           <w:noProof/>
         </w:rPr>
         <w:drawing>
-          <wp:inline distT="0" distB="0" distL="0" distR="0" wp14:anchorId="2BB9503B" wp14:editId="7F47B7AE">
-            <wp:extent cx="5334000" cy="3581400"/>
-            <wp:effectExtent l="0" t="0" r="0" b="0"/>
-            <wp:docPr id="4" name="books.png" descr="หน้ารายการหนังสือ พร้อมช่องค้นหาและตัวกรองหมวดหมู่" title="หน้ารายการหนังสือ พร้อมช่องค้นหาและตัวกรองหมวดหมู่"/>
+          <wp:inline distT="0" distB="0" distL="0" distR="0" wp14:anchorId="7A44CE15" wp14:editId="55388B5B">
+            <wp:extent cx="5334000" cy="4013206"/>
+            <wp:effectExtent l="19050" t="19050" r="19050" b="25400"/>
+            <wp:docPr id="515286358" name="รูปภาพ 8"/>
             <wp:cNvGraphicFramePr>
               <a:graphicFrameLocks xmlns:a="http://schemas.openxmlformats.org/drawingml/2006/main" noChangeAspect="1"/>
             </wp:cNvGraphicFramePr>
@@ -2241,26 +2229,34 @@
               <a:graphicData uri="http://schemas.openxmlformats.org/drawingml/2006/picture">
                 <pic:pic xmlns:pic="http://schemas.openxmlformats.org/drawingml/2006/picture">
                   <pic:nvPicPr>
-                    <pic:cNvPr id="0" name=""/>
-                    <pic:cNvPicPr>
-                      <a:picLocks noChangeAspect="1" noChangeArrowheads="1"/>
-                    </pic:cNvPicPr>
+                    <pic:cNvPr id="515286358" name=""/>
+                    <pic:cNvPicPr/>
                   </pic:nvPicPr>
                   <pic:blipFill>
-                    <a:blip r:embed="rId10"/>
-                    <a:srcRect/>
+                    <a:blip r:embed="rId10">
+                      <a:extLst>
+                        <a:ext uri="{28A0092B-C50C-407E-A947-70E740481C1C}">
+                          <a14:useLocalDpi xmlns:a14="http://schemas.microsoft.com/office/drawing/2010/main" val="0"/>
+                        </a:ext>
+                      </a:extLst>
+                    </a:blip>
                     <a:stretch>
                       <a:fillRect/>
                     </a:stretch>
                   </pic:blipFill>
-                  <pic:spPr bwMode="auto">
+                  <pic:spPr>
                     <a:xfrm>
                       <a:off x="0" y="0"/>
-                      <a:ext cx="5334000" cy="3581400"/>
+                      <a:ext cx="5334000" cy="4013206"/>
                     </a:xfrm>
                     <a:prstGeom prst="rect">
                       <a:avLst/>
                     </a:prstGeom>
+                    <a:ln w="9525">
+                      <a:solidFill>
+                        <a:srgbClr val="C9D1DA"/>
+                      </a:solidFill>
+                    </a:ln>
                   </pic:spPr>
                 </pic:pic>
               </a:graphicData>
@@ -2288,10 +2284,7 @@
         <w:pStyle w:val="2"/>
       </w:pPr>
       <w:r>
-        <w:t xml:space="preserve">4.2 </w:t>
-      </w:r>
-      <w:r>
-        <w:t>เพิ่มหนังสือ</w:t>
+        <w:t>4.2 เพิ่มหนังสือ</w:t>
       </w:r>
     </w:p>
     <w:p>
@@ -2887,10 +2880,10 @@
           <w:noProof/>
         </w:rPr>
         <w:drawing>
-          <wp:inline distT="0" distB="0" distL="0" distR="0" wp14:anchorId="7D5E7CA7" wp14:editId="2CE108FB">
-            <wp:extent cx="5334000" cy="2590800"/>
-            <wp:effectExtent l="0" t="0" r="0" b="0"/>
-            <wp:docPr id="5" name="bookform.png" descr="แบบฟอร์มเพิ่มหนังสือ" title="แบบฟอร์มเพิ่มหนังสือ"/>
+          <wp:inline distT="0" distB="0" distL="0" distR="0" wp14:anchorId="79E740EA" wp14:editId="10AD6DD8">
+            <wp:extent cx="5334000" cy="2021081"/>
+            <wp:effectExtent l="19050" t="19050" r="19050" b="17780"/>
+            <wp:docPr id="607193288" name="รูปภาพ 7"/>
             <wp:cNvGraphicFramePr>
               <a:graphicFrameLocks xmlns:a="http://schemas.openxmlformats.org/drawingml/2006/main" noChangeAspect="1"/>
             </wp:cNvGraphicFramePr>
@@ -2898,26 +2891,34 @@
               <a:graphicData uri="http://schemas.openxmlformats.org/drawingml/2006/picture">
                 <pic:pic xmlns:pic="http://schemas.openxmlformats.org/drawingml/2006/picture">
                   <pic:nvPicPr>
-                    <pic:cNvPr id="0" name=""/>
-                    <pic:cNvPicPr>
-                      <a:picLocks noChangeAspect="1" noChangeArrowheads="1"/>
-                    </pic:cNvPicPr>
+                    <pic:cNvPr id="607193288" name=""/>
+                    <pic:cNvPicPr/>
                   </pic:nvPicPr>
                   <pic:blipFill>
-                    <a:blip r:embed="rId11"/>
-                    <a:srcRect/>
+                    <a:blip r:embed="rId11">
+                      <a:extLst>
+                        <a:ext uri="{28A0092B-C50C-407E-A947-70E740481C1C}">
+                          <a14:useLocalDpi xmlns:a14="http://schemas.microsoft.com/office/drawing/2010/main" val="0"/>
+                        </a:ext>
+                      </a:extLst>
+                    </a:blip>
                     <a:stretch>
                       <a:fillRect/>
                     </a:stretch>
                   </pic:blipFill>
-                  <pic:spPr bwMode="auto">
+                  <pic:spPr>
                     <a:xfrm>
                       <a:off x="0" y="0"/>
-                      <a:ext cx="5334000" cy="2590800"/>
+                      <a:ext cx="5334000" cy="2021081"/>
                     </a:xfrm>
                     <a:prstGeom prst="rect">
                       <a:avLst/>
                     </a:prstGeom>
+                    <a:ln w="9525">
+                      <a:solidFill>
+                        <a:srgbClr val="C9D1DA"/>
+                      </a:solidFill>
+                    </a:ln>
                   </pic:spPr>
                 </pic:pic>
               </a:graphicData>
@@ -2945,10 +2946,7 @@
         <w:pStyle w:val="2"/>
       </w:pPr>
       <w:r>
-        <w:t xml:space="preserve">4.3 </w:t>
-      </w:r>
-      <w:r>
-        <w:t>แก้ไขและลบหนังสือ</w:t>
+        <w:t>4.3 แก้ไขและลบหนังสือ</w:t>
       </w:r>
     </w:p>
     <w:p>
@@ -3003,10 +3001,7 @@
         <w:pStyle w:val="1"/>
       </w:pPr>
       <w:r>
-        <w:t xml:space="preserve">5. </w:t>
-      </w:r>
-      <w:r>
-        <w:t>การจัดการสมาชิก</w:t>
+        <w:t>5. การจัดการสมาชิก</w:t>
       </w:r>
     </w:p>
     <w:p>
@@ -3014,10 +3009,7 @@
         <w:pStyle w:val="2"/>
       </w:pPr>
       <w:r>
-        <w:t xml:space="preserve">5.1 </w:t>
-      </w:r>
-      <w:r>
-        <w:t>ค้นหาสมาชิก</w:t>
+        <w:t>5.1 ค้นหาสมาชิก</w:t>
       </w:r>
     </w:p>
     <w:p>
@@ -3039,10 +3031,10 @@
           <w:noProof/>
         </w:rPr>
         <w:drawing>
-          <wp:inline distT="0" distB="0" distL="0" distR="0" wp14:anchorId="502257D4" wp14:editId="50904744">
-            <wp:extent cx="5334000" cy="2286000"/>
-            <wp:effectExtent l="0" t="0" r="0" b="0"/>
-            <wp:docPr id="6" name="members.png" descr="หน้ารายการสมาชิก" title="หน้ารายการสมาชิก"/>
+          <wp:inline distT="0" distB="0" distL="0" distR="0" wp14:anchorId="31F5E642" wp14:editId="0C55128F">
+            <wp:extent cx="5334000" cy="2463119"/>
+            <wp:effectExtent l="19050" t="19050" r="19050" b="13970"/>
+            <wp:docPr id="676874396" name="รูปภาพ 6"/>
             <wp:cNvGraphicFramePr>
               <a:graphicFrameLocks xmlns:a="http://schemas.openxmlformats.org/drawingml/2006/main" noChangeAspect="1"/>
             </wp:cNvGraphicFramePr>
@@ -3050,26 +3042,34 @@
               <a:graphicData uri="http://schemas.openxmlformats.org/drawingml/2006/picture">
                 <pic:pic xmlns:pic="http://schemas.openxmlformats.org/drawingml/2006/picture">
                   <pic:nvPicPr>
-                    <pic:cNvPr id="0" name=""/>
-                    <pic:cNvPicPr>
-                      <a:picLocks noChangeAspect="1" noChangeArrowheads="1"/>
-                    </pic:cNvPicPr>
+                    <pic:cNvPr id="676874396" name=""/>
+                    <pic:cNvPicPr/>
                   </pic:nvPicPr>
                   <pic:blipFill>
-                    <a:blip r:embed="rId12"/>
-                    <a:srcRect/>
+                    <a:blip r:embed="rId12">
+                      <a:extLst>
+                        <a:ext uri="{28A0092B-C50C-407E-A947-70E740481C1C}">
+                          <a14:useLocalDpi xmlns:a14="http://schemas.microsoft.com/office/drawing/2010/main" val="0"/>
+                        </a:ext>
+                      </a:extLst>
+                    </a:blip>
                     <a:stretch>
                       <a:fillRect/>
                     </a:stretch>
                   </pic:blipFill>
-                  <pic:spPr bwMode="auto">
+                  <pic:spPr>
                     <a:xfrm>
                       <a:off x="0" y="0"/>
-                      <a:ext cx="5334000" cy="2286000"/>
+                      <a:ext cx="5334000" cy="2463119"/>
                     </a:xfrm>
                     <a:prstGeom prst="rect">
                       <a:avLst/>
                     </a:prstGeom>
+                    <a:ln w="9525">
+                      <a:solidFill>
+                        <a:srgbClr val="C9D1DA"/>
+                      </a:solidFill>
+                    </a:ln>
                   </pic:spPr>
                 </pic:pic>
               </a:graphicData>
@@ -3097,10 +3097,7 @@
         <w:pStyle w:val="2"/>
       </w:pPr>
       <w:r>
-        <w:t xml:space="preserve">5.2 </w:t>
-      </w:r>
-      <w:r>
-        <w:t>เพิ่มสมาชิก</w:t>
+        <w:t>5.2 เพิ่มสมาชิก</w:t>
       </w:r>
     </w:p>
     <w:p>
@@ -3649,10 +3646,10 @@
           <w:noProof/>
         </w:rPr>
         <w:drawing>
-          <wp:inline distT="0" distB="0" distL="0" distR="0" wp14:anchorId="4A0AE115" wp14:editId="1E69B341">
-            <wp:extent cx="5334000" cy="2114550"/>
-            <wp:effectExtent l="0" t="0" r="0" b="0"/>
-            <wp:docPr id="7" name="memform.png" descr="แบบฟอร์มเพิ่มสมาชิก" title="แบบฟอร์มเพิ่มสมาชิก"/>
+          <wp:inline distT="0" distB="0" distL="0" distR="0" wp14:anchorId="5301736F" wp14:editId="10588E3F">
+            <wp:extent cx="5334000" cy="1666506"/>
+            <wp:effectExtent l="19050" t="19050" r="19050" b="10160"/>
+            <wp:docPr id="2041130599" name="รูปภาพ 5"/>
             <wp:cNvGraphicFramePr>
               <a:graphicFrameLocks xmlns:a="http://schemas.openxmlformats.org/drawingml/2006/main" noChangeAspect="1"/>
             </wp:cNvGraphicFramePr>
@@ -3660,26 +3657,34 @@
               <a:graphicData uri="http://schemas.openxmlformats.org/drawingml/2006/picture">
                 <pic:pic xmlns:pic="http://schemas.openxmlformats.org/drawingml/2006/picture">
                   <pic:nvPicPr>
-                    <pic:cNvPr id="0" name=""/>
-                    <pic:cNvPicPr>
-                      <a:picLocks noChangeAspect="1" noChangeArrowheads="1"/>
-                    </pic:cNvPicPr>
+                    <pic:cNvPr id="2041130599" name=""/>
+                    <pic:cNvPicPr/>
                   </pic:nvPicPr>
                   <pic:blipFill>
-                    <a:blip r:embed="rId13"/>
-                    <a:srcRect/>
+                    <a:blip r:embed="rId13">
+                      <a:extLst>
+                        <a:ext uri="{28A0092B-C50C-407E-A947-70E740481C1C}">
+                          <a14:useLocalDpi xmlns:a14="http://schemas.microsoft.com/office/drawing/2010/main" val="0"/>
+                        </a:ext>
+                      </a:extLst>
+                    </a:blip>
                     <a:stretch>
                       <a:fillRect/>
                     </a:stretch>
                   </pic:blipFill>
-                  <pic:spPr bwMode="auto">
+                  <pic:spPr>
                     <a:xfrm>
                       <a:off x="0" y="0"/>
-                      <a:ext cx="5334000" cy="2114550"/>
+                      <a:ext cx="5334000" cy="1666506"/>
                     </a:xfrm>
                     <a:prstGeom prst="rect">
                       <a:avLst/>
                     </a:prstGeom>
+                    <a:ln w="9525">
+                      <a:solidFill>
+                        <a:srgbClr val="C9D1DA"/>
+                      </a:solidFill>
+                    </a:ln>
                   </pic:spPr>
                 </pic:pic>
               </a:graphicData>
@@ -3707,10 +3712,7 @@
         <w:pStyle w:val="2"/>
       </w:pPr>
       <w:r>
-        <w:t xml:space="preserve">5.3 </w:t>
-      </w:r>
-      <w:r>
-        <w:t>ระงับและเปิดใช้งานสมาชิก</w:t>
+        <w:t>5.3 ระงับและเปิดใช้งานสมาชิก</w:t>
       </w:r>
     </w:p>
     <w:p>
@@ -3757,10 +3759,7 @@
         <w:pStyle w:val="1"/>
       </w:pPr>
       <w:r>
-        <w:t xml:space="preserve">6. </w:t>
-      </w:r>
-      <w:r>
-        <w:t>การยืมหนังสือ</w:t>
+        <w:t>6. การยืมหนังสือ</w:t>
       </w:r>
     </w:p>
     <w:p>
@@ -3794,10 +3793,7 @@
         <w:spacing w:after="80"/>
       </w:pPr>
       <w:r>
-        <w:t xml:space="preserve">เลือกสมาชิกจากรายการ "สมาชิก" รายการแสดงจำนวนที่ยืมค้างต่อท้ายชื่อ เช่น "(ยืมค้าง 1)" </w:t>
-      </w:r>
-      <w:r>
-        <w:t>และแสดง "ถูกระงับ" สำหรับสมาชิกที่ยืมไม่ได้</w:t>
+        <w:t>เลือกสมาชิกจากรายการ "สมาชิก" รายการแสดงจำนวนที่ยืมค้างต่อท้ายชื่อ เช่น "(ยืมค้าง 1)" และแสดง "ถูกระงับ" สำหรับสมาชิกที่ยืมไม่ได้</w:t>
       </w:r>
     </w:p>
     <w:p>
@@ -3855,10 +3851,10 @@
           <w:noProof/>
         </w:rPr>
         <w:drawing>
-          <wp:inline distT="0" distB="0" distL="0" distR="0" wp14:anchorId="580E892C" wp14:editId="40B13E8B">
-            <wp:extent cx="5334000" cy="1866900"/>
-            <wp:effectExtent l="0" t="0" r="0" b="0"/>
-            <wp:docPr id="8" name="borrow.png" descr="หน้ายืมหนังสือ" title="หน้ายืมหนังสือ"/>
+          <wp:inline distT="0" distB="0" distL="0" distR="0" wp14:anchorId="730B69B8" wp14:editId="4158E60D">
+            <wp:extent cx="5334000" cy="1829019"/>
+            <wp:effectExtent l="19050" t="19050" r="19050" b="19050"/>
+            <wp:docPr id="1844572023" name="รูปภาพ 4"/>
             <wp:cNvGraphicFramePr>
               <a:graphicFrameLocks xmlns:a="http://schemas.openxmlformats.org/drawingml/2006/main" noChangeAspect="1"/>
             </wp:cNvGraphicFramePr>
@@ -3866,26 +3862,34 @@
               <a:graphicData uri="http://schemas.openxmlformats.org/drawingml/2006/picture">
                 <pic:pic xmlns:pic="http://schemas.openxmlformats.org/drawingml/2006/picture">
                   <pic:nvPicPr>
-                    <pic:cNvPr id="0" name=""/>
-                    <pic:cNvPicPr>
-                      <a:picLocks noChangeAspect="1" noChangeArrowheads="1"/>
-                    </pic:cNvPicPr>
+                    <pic:cNvPr id="1844572023" name=""/>
+                    <pic:cNvPicPr/>
                   </pic:nvPicPr>
                   <pic:blipFill>
-                    <a:blip r:embed="rId14"/>
-                    <a:srcRect/>
+                    <a:blip r:embed="rId14">
+                      <a:extLst>
+                        <a:ext uri="{28A0092B-C50C-407E-A947-70E740481C1C}">
+                          <a14:useLocalDpi xmlns:a14="http://schemas.microsoft.com/office/drawing/2010/main" val="0"/>
+                        </a:ext>
+                      </a:extLst>
+                    </a:blip>
                     <a:stretch>
                       <a:fillRect/>
                     </a:stretch>
                   </pic:blipFill>
-                  <pic:spPr bwMode="auto">
+                  <pic:spPr>
                     <a:xfrm>
                       <a:off x="0" y="0"/>
-                      <a:ext cx="5334000" cy="1866900"/>
+                      <a:ext cx="5334000" cy="1829019"/>
                     </a:xfrm>
                     <a:prstGeom prst="rect">
                       <a:avLst/>
                     </a:prstGeom>
+                    <a:ln w="9525">
+                      <a:solidFill>
+                        <a:srgbClr val="C9D1DA"/>
+                      </a:solidFill>
+                    </a:ln>
                   </pic:spPr>
                 </pic:pic>
               </a:graphicData>
@@ -4004,10 +4008,7 @@
         <w:pStyle w:val="1"/>
       </w:pPr>
       <w:r>
-        <w:t xml:space="preserve">7. </w:t>
-      </w:r>
-      <w:r>
-        <w:t>การคืนหนังสือ</w:t>
+        <w:t>7. การคืนหนังสือ</w:t>
       </w:r>
     </w:p>
     <w:p>
@@ -4046,10 +4047,7 @@
         <w:spacing w:after="80"/>
       </w:pPr>
       <w:r>
-        <w:t xml:space="preserve">ระบบแสดงหัวข้อ "รายการยืมค้างของ ..." </w:t>
-      </w:r>
-      <w:r>
-        <w:t>พร้อมตาราง ชื่อหนังสือ, วันที่ยืม, กำหนดคืน และ "ค่าปรับถ้าคืนวันนี้"</w:t>
+        <w:t>ระบบแสดงหัวข้อ "รายการยืมค้างของ ..." พร้อมตาราง ชื่อหนังสือ, วันที่ยืม, กำหนดคืน และ "ค่าปรับถ้าคืนวันนี้"</w:t>
       </w:r>
     </w:p>
     <w:p>
@@ -4101,10 +4099,10 @@
           <w:noProof/>
         </w:rPr>
         <w:drawing>
-          <wp:inline distT="0" distB="0" distL="0" distR="0" wp14:anchorId="6AB92100" wp14:editId="5B33FA47">
-            <wp:extent cx="5334000" cy="2009775"/>
-            <wp:effectExtent l="0" t="0" r="0" b="0"/>
-            <wp:docPr id="9" name="ret.png" descr="หน้าคืนหนังสือ แสดงรายการยืมค้างของสมาชิกที่เลือก" title="หน้าคืนหนังสือ แสดงรายการยืมค้างของสมาชิกที่เลือก"/>
+          <wp:inline distT="0" distB="0" distL="0" distR="0" wp14:anchorId="7CFE8ED8" wp14:editId="19247C97">
+            <wp:extent cx="5334000" cy="2054766"/>
+            <wp:effectExtent l="19050" t="19050" r="19050" b="22225"/>
+            <wp:docPr id="760884720" name="รูปภาพ 3"/>
             <wp:cNvGraphicFramePr>
               <a:graphicFrameLocks xmlns:a="http://schemas.openxmlformats.org/drawingml/2006/main" noChangeAspect="1"/>
             </wp:cNvGraphicFramePr>
@@ -4112,26 +4110,34 @@
               <a:graphicData uri="http://schemas.openxmlformats.org/drawingml/2006/picture">
                 <pic:pic xmlns:pic="http://schemas.openxmlformats.org/drawingml/2006/picture">
                   <pic:nvPicPr>
-                    <pic:cNvPr id="0" name=""/>
-                    <pic:cNvPicPr>
-                      <a:picLocks noChangeAspect="1" noChangeArrowheads="1"/>
-                    </pic:cNvPicPr>
+                    <pic:cNvPr id="760884720" name=""/>
+                    <pic:cNvPicPr/>
                   </pic:nvPicPr>
                   <pic:blipFill>
-                    <a:blip r:embed="rId15"/>
-                    <a:srcRect/>
+                    <a:blip r:embed="rId15">
+                      <a:extLst>
+                        <a:ext uri="{28A0092B-C50C-407E-A947-70E740481C1C}">
+                          <a14:useLocalDpi xmlns:a14="http://schemas.microsoft.com/office/drawing/2010/main" val="0"/>
+                        </a:ext>
+                      </a:extLst>
+                    </a:blip>
                     <a:stretch>
                       <a:fillRect/>
                     </a:stretch>
                   </pic:blipFill>
-                  <pic:spPr bwMode="auto">
+                  <pic:spPr>
                     <a:xfrm>
                       <a:off x="0" y="0"/>
-                      <a:ext cx="5334000" cy="2009775"/>
+                      <a:ext cx="5334000" cy="2054766"/>
                     </a:xfrm>
                     <a:prstGeom prst="rect">
                       <a:avLst/>
                     </a:prstGeom>
+                    <a:ln w="9525">
+                      <a:solidFill>
+                        <a:srgbClr val="C9D1DA"/>
+                      </a:solidFill>
+                    </a:ln>
                   </pic:spPr>
                 </pic:pic>
               </a:graphicData>
@@ -4217,10 +4223,7 @@
         <w:pStyle w:val="1"/>
       </w:pPr>
       <w:r>
-        <w:t xml:space="preserve">8. </w:t>
-      </w:r>
-      <w:r>
-        <w:t>รายการเกินกำหนด</w:t>
+        <w:t>8. รายการเกินกำหนด</w:t>
       </w:r>
     </w:p>
     <w:p>
@@ -4631,10 +4634,10 @@
           <w:noProof/>
         </w:rPr>
         <w:drawing>
-          <wp:inline distT="0" distB="0" distL="0" distR="0" wp14:anchorId="74156A9A" wp14:editId="74A79CF7">
-            <wp:extent cx="5334000" cy="1438275"/>
-            <wp:effectExtent l="0" t="0" r="0" b="0"/>
-            <wp:docPr id="10" name="overdue.png" descr="หน้ารายการเกินกำหนด (ตัวอย่างกรณีไม่มีรายการ)" title="หน้ารายการเกินกำหนด (ตัวอย่างกรณีไม่มีรายการ)"/>
+          <wp:inline distT="0" distB="0" distL="0" distR="0" wp14:anchorId="127295CE" wp14:editId="7ECBB5E5">
+            <wp:extent cx="5334000" cy="1841430"/>
+            <wp:effectExtent l="19050" t="19050" r="19050" b="26035"/>
+            <wp:docPr id="364358023" name="รูปภาพ 2"/>
             <wp:cNvGraphicFramePr>
               <a:graphicFrameLocks xmlns:a="http://schemas.openxmlformats.org/drawingml/2006/main" noChangeAspect="1"/>
             </wp:cNvGraphicFramePr>
@@ -4642,26 +4645,34 @@
               <a:graphicData uri="http://schemas.openxmlformats.org/drawingml/2006/picture">
                 <pic:pic xmlns:pic="http://schemas.openxmlformats.org/drawingml/2006/picture">
                   <pic:nvPicPr>
-                    <pic:cNvPr id="0" name=""/>
-                    <pic:cNvPicPr>
-                      <a:picLocks noChangeAspect="1" noChangeArrowheads="1"/>
-                    </pic:cNvPicPr>
+                    <pic:cNvPr id="364358023" name=""/>
+                    <pic:cNvPicPr/>
                   </pic:nvPicPr>
                   <pic:blipFill>
-                    <a:blip r:embed="rId16"/>
-                    <a:srcRect/>
+                    <a:blip r:embed="rId16">
+                      <a:extLst>
+                        <a:ext uri="{28A0092B-C50C-407E-A947-70E740481C1C}">
+                          <a14:useLocalDpi xmlns:a14="http://schemas.microsoft.com/office/drawing/2010/main" val="0"/>
+                        </a:ext>
+                      </a:extLst>
+                    </a:blip>
                     <a:stretch>
                       <a:fillRect/>
                     </a:stretch>
                   </pic:blipFill>
-                  <pic:spPr bwMode="auto">
+                  <pic:spPr>
                     <a:xfrm>
                       <a:off x="0" y="0"/>
-                      <a:ext cx="5334000" cy="1438275"/>
+                      <a:ext cx="5334000" cy="1841430"/>
                     </a:xfrm>
                     <a:prstGeom prst="rect">
                       <a:avLst/>
                     </a:prstGeom>
+                    <a:ln w="9525">
+                      <a:solidFill>
+                        <a:srgbClr val="C9D1DA"/>
+                      </a:solidFill>
+                    </a:ln>
                   </pic:spPr>
                 </pic:pic>
               </a:graphicData>
@@ -4681,7 +4692,16 @@
           <w:sz w:val="28"/>
           <w:szCs w:val="28"/>
         </w:rPr>
-        <w:t>ภาพที่ 10 หน้ารายการเกินกำหนด (ตัวอย่างกรณีไม่มีรายการ)</w:t>
+        <w:t xml:space="preserve">ภาพที่ 10 หน้ารายการเกินกำหนด </w:t>
+      </w:r>
+      <w:r>
+        <w:rPr>
+          <w:color w:val="FF0000"/>
+          <w:sz w:val="28"/>
+          <w:szCs w:val="28"/>
+          <w:cs/>
+        </w:rPr>
+        <w:t>พร้อมจำนวนวันที่เกินและค่าปรับสะสม ณ วันนี้</w:t>
       </w:r>
     </w:p>
     <w:p>
@@ -4689,10 +4709,7 @@
         <w:pStyle w:val="1"/>
       </w:pPr>
       <w:r>
-        <w:t xml:space="preserve">9. </w:t>
-      </w:r>
-      <w:r>
-        <w:t>รายงานประวัติการยืม-คืน</w:t>
+        <w:t>9. รายงานประวัติการยืม-คืน</w:t>
       </w:r>
     </w:p>
     <w:p>
@@ -4731,13 +4748,7 @@
         <w:spacing w:after="80"/>
       </w:pPr>
       <w:r>
-        <w:t>กด "แสดงรายงาน" (หรือ "ล้างตัวกรอง</w:t>
-      </w:r>
-      <w:r>
-        <w:t xml:space="preserve">" </w:t>
-      </w:r>
-      <w:r>
-        <w:t>เพื่อเริ่มใหม่)</w:t>
+        <w:t>กด "แสดงรายงาน" (หรือ "ล้างตัวกรอง" เพื่อเริ่มใหม่)</w:t>
       </w:r>
     </w:p>
     <w:p>
@@ -4777,10 +4788,10 @@
           <w:noProof/>
         </w:rPr>
         <w:drawing>
-          <wp:inline distT="0" distB="0" distL="0" distR="0" wp14:anchorId="5D3D95DB" wp14:editId="1EAAE294">
-            <wp:extent cx="5334000" cy="2695575"/>
-            <wp:effectExtent l="0" t="0" r="0" b="0"/>
-            <wp:docPr id="11" name="hist.png" descr="หน้ารายงานประวัติการยืม-คืน" title="หน้ารายงานประวัติการยืม-คืน"/>
+          <wp:inline distT="0" distB="0" distL="0" distR="0" wp14:anchorId="4F2DE6B5" wp14:editId="33B12597">
+            <wp:extent cx="5334000" cy="3454749"/>
+            <wp:effectExtent l="19050" t="19050" r="19050" b="12700"/>
+            <wp:docPr id="468618952" name="รูปภาพ 1"/>
             <wp:cNvGraphicFramePr>
               <a:graphicFrameLocks xmlns:a="http://schemas.openxmlformats.org/drawingml/2006/main" noChangeAspect="1"/>
             </wp:cNvGraphicFramePr>
@@ -4788,26 +4799,34 @@
               <a:graphicData uri="http://schemas.openxmlformats.org/drawingml/2006/picture">
                 <pic:pic xmlns:pic="http://schemas.openxmlformats.org/drawingml/2006/picture">
                   <pic:nvPicPr>
-                    <pic:cNvPr id="0" name=""/>
-                    <pic:cNvPicPr>
-                      <a:picLocks noChangeAspect="1" noChangeArrowheads="1"/>
-                    </pic:cNvPicPr>
+                    <pic:cNvPr id="468618952" name=""/>
+                    <pic:cNvPicPr/>
                   </pic:nvPicPr>
                   <pic:blipFill>
-                    <a:blip r:embed="rId17"/>
-                    <a:srcRect/>
+                    <a:blip r:embed="rId17">
+                      <a:extLst>
+                        <a:ext uri="{28A0092B-C50C-407E-A947-70E740481C1C}">
+                          <a14:useLocalDpi xmlns:a14="http://schemas.microsoft.com/office/drawing/2010/main" val="0"/>
+                        </a:ext>
+                      </a:extLst>
+                    </a:blip>
                     <a:stretch>
                       <a:fillRect/>
                     </a:stretch>
                   </pic:blipFill>
-                  <pic:spPr bwMode="auto">
+                  <pic:spPr>
                     <a:xfrm>
                       <a:off x="0" y="0"/>
-                      <a:ext cx="5334000" cy="2695575"/>
+                      <a:ext cx="5334000" cy="3454749"/>
                     </a:xfrm>
                     <a:prstGeom prst="rect">
                       <a:avLst/>
                     </a:prstGeom>
+                    <a:ln w="9525">
+                      <a:solidFill>
+                        <a:srgbClr val="C9D1DA"/>
+                      </a:solidFill>
+                    </a:ln>
                   </pic:spPr>
                 </pic:pic>
               </a:graphicData>
@@ -4835,10 +4854,7 @@
         <w:pStyle w:val="1"/>
       </w:pPr>
       <w:r>
-        <w:t xml:space="preserve">10. </w:t>
-      </w:r>
-      <w:r>
-        <w:t>ปัญหาที่พบบ่อยและข้อแนะนำ</w:t>
+        <w:t>10. ปัญหาที่พบบ่อยและข้อแนะนำ</w:t>
       </w:r>
     </w:p>
     <w:tbl>
@@ -5288,19 +5304,12 @@
         <w:spacing w:after="80"/>
       </w:pPr>
       <w:r>
-        <w:t xml:space="preserve">สิ้นสุดวัน </w:t>
-      </w:r>
-      <w:r>
-        <w:t>ตรวจรายงานประวัติการยืม-คืนตามช่วงวันที่</w:t>
+        <w:t>สิ้นสุดวัน ตรวจรายงานประวัติการยืม-คืนตามช่วงวันที่</w:t>
       </w:r>
     </w:p>
     <w:sectPr>
-      <w:headerReference w:type="even" r:id="rId18"/>
-      <w:headerReference w:type="default" r:id="rId19"/>
-      <w:footerReference w:type="even" r:id="rId20"/>
-      <w:footerReference w:type="default" r:id="rId21"/>
-      <w:headerReference w:type="first" r:id="rId22"/>
-      <w:footerReference w:type="first" r:id="rId23"/>
+      <w:headerReference w:type="default" r:id="rId18"/>
+      <w:footerReference w:type="default" r:id="rId19"/>
       <w:pgSz w:w="11906" w:h="16838"/>
       <w:pgMar w:top="1440" w:right="1440" w:bottom="1440" w:left="1440" w:header="708" w:footer="708" w:gutter="0"/>
       <w:cols w:space="720"/>
@@ -5330,16 +5339,6 @@
 </file>
 
 <file path=word/footer1.xml><?xml version="1.0" encoding="utf-8"?>
-<w:ftr xmlns:wpc="http://schemas.microsoft.com/office/word/2010/wordprocessingCanvas" xmlns:cx="http://schemas.microsoft.com/office/drawing/2014/chartex" xmlns:cx1="http://schemas.microsoft.com/office/drawing/2015/9/8/chartex" xmlns:cx2="http://schemas.microsoft.com/office/drawing/2015/10/21/chartex" xmlns:cx3="http://schemas.microsoft.com/office/drawing/2016/5/9/chartex" xmlns:cx4="http://schemas.microsoft.com/office/drawing/2016/5/10/chartex" xmlns:cx5="http://schemas.microsoft.com/office/drawing/2016/5/11/chartex" xmlns:cx6="http://schemas.microsoft.com/office/drawing/2016/5/12/chartex" xmlns:cx7="http://schemas.microsoft.com/office/drawing/2016/5/13/chartex" xmlns:cx8="http://schemas.microsoft.com/office/drawing/2016/5/14/chartex" xmlns:mc="http://schemas.openxmlformats.org/markup-compatibility/2006" xmlns:aink="http://schemas.microsoft.com/office/drawing/2016/ink" xmlns:am3d="http://schemas.microsoft.com/office/drawing/2017/model3d" xmlns:o="urn:schemas-microsoft-com:office:office" xmlns:oel="http://schemas.microsoft.com/office/2019/extlst" xmlns:r="http://schemas.openxmlformats.org/officeDocument/2006/relationships" xmlns:m="http://schemas.openxmlformats.org/officeDocument/2006/math" xmlns:v="urn:schemas-microsoft-com:vml" xmlns:wp14="http://schemas.microsoft.com/office/word/2010/wordprocessingDrawing" xmlns:wp="http://schemas.openxmlformats.org/drawingml/2006/wordprocessingDrawing" xmlns:w10="urn:schemas-microsoft-com:office:word" xmlns:w="http://schemas.openxmlformats.org/wordprocessingml/2006/main" xmlns:w14="http://schemas.microsoft.com/office/word/2010/wordml" xmlns:w15="http://schemas.microsoft.com/office/word/2012/wordml" xmlns:w16cex="http://schemas.microsoft.com/office/word/2018/wordml/cex" xmlns:w16cid="http://schemas.microsoft.com/office/word/2016/wordml/cid" xmlns:w16="http://schemas.microsoft.com/office/word/2018/wordml" xmlns:w16du="http://schemas.microsoft.com/office/word/2023/wordml/word16du" xmlns:w16sdtdh="http://schemas.microsoft.com/office/word/2020/wordml/sdtdatahash" xmlns:w16sdtfl="http://schemas.microsoft.com/office/word/2024/wordml/sdtformatlock" xmlns:w16se="http://schemas.microsoft.com/office/word/2015/wordml/symex" xmlns:wpg="http://schemas.microsoft.com/office/word/2010/wordprocessingGroup" xmlns:wpi="http://schemas.microsoft.com/office/word/2010/wordprocessingInk" xmlns:wne="http://schemas.microsoft.com/office/word/2006/wordml" xmlns:wps="http://schemas.microsoft.com/office/word/2010/wordprocessingShape" mc:Ignorable="w14 w15 w16se w16cid w16 w16cex w16sdtdh w16sdtfl w16du wp14">
-  <w:p>
-    <w:pPr>
-      <w:pStyle w:val="ae"/>
-    </w:pPr>
-  </w:p>
-</w:ftr>
-</file>
-
-<file path=word/footer2.xml><?xml version="1.0" encoding="utf-8"?>
 <w:ftr xmlns:wpc="http://schemas.microsoft.com/office/word/2010/wordprocessingCanvas" xmlns:cx="http://schemas.microsoft.com/office/drawing/2014/chartex" xmlns:cx1="http://schemas.microsoft.com/office/drawing/2015/9/8/chartex" xmlns:cx2="http://schemas.microsoft.com/office/drawing/2015/10/21/chartex" xmlns:cx3="http://schemas.microsoft.com/office/drawing/2016/5/9/chartex" xmlns:cx4="http://schemas.microsoft.com/office/drawing/2016/5/10/chartex" xmlns:cx5="http://schemas.microsoft.com/office/drawing/2016/5/11/chartex" xmlns:cx6="http://schemas.microsoft.com/office/drawing/2016/5/12/chartex" xmlns:cx7="http://schemas.microsoft.com/office/drawing/2016/5/13/chartex" xmlns:cx8="http://schemas.microsoft.com/office/drawing/2016/5/14/chartex" xmlns:mc="http://schemas.openxmlformats.org/markup-compatibility/2006" xmlns:aink="http://schemas.microsoft.com/office/drawing/2016/ink" xmlns:am3d="http://schemas.microsoft.com/office/drawing/2017/model3d" xmlns:o="urn:schemas-microsoft-com:office:office" xmlns:oel="http://schemas.microsoft.com/office/2019/extlst" xmlns:r="http://schemas.openxmlformats.org/officeDocument/2006/relationships" xmlns:m="http://schemas.openxmlformats.org/officeDocument/2006/math" xmlns:v="urn:schemas-microsoft-com:vml" xmlns:wp14="http://schemas.microsoft.com/office/word/2010/wordprocessingDrawing" xmlns:wp="http://schemas.openxmlformats.org/drawingml/2006/wordprocessingDrawing" xmlns:w10="urn:schemas-microsoft-com:office:word" xmlns:w="http://schemas.openxmlformats.org/wordprocessingml/2006/main" xmlns:w14="http://schemas.microsoft.com/office/word/2010/wordml" xmlns:w15="http://schemas.microsoft.com/office/word/2012/wordml" xmlns:w16cex="http://schemas.microsoft.com/office/word/2018/wordml/cex" xmlns:w16cid="http://schemas.microsoft.com/office/word/2016/wordml/cid" xmlns:w16="http://schemas.microsoft.com/office/word/2018/wordml" xmlns:w16du="http://schemas.microsoft.com/office/word/2023/wordml/word16du" xmlns:w16sdtdh="http://schemas.microsoft.com/office/word/2020/wordml/sdtdatahash" xmlns:w16sdtfl="http://schemas.microsoft.com/office/word/2024/wordml/sdtformatlock" xmlns:w16se="http://schemas.microsoft.com/office/word/2015/wordml/symex" xmlns:wpg="http://schemas.microsoft.com/office/word/2010/wordprocessingGroup" xmlns:wpi="http://schemas.microsoft.com/office/word/2010/wordprocessingInk" xmlns:wne="http://schemas.microsoft.com/office/word/2006/wordml" xmlns:wps="http://schemas.microsoft.com/office/word/2010/wordprocessingShape" mc:Ignorable="w14 w15 w16se w16cid w16 w16cex w16sdtdh w16sdtfl w16du wp14">
   <w:p>
     <w:pPr>
@@ -5398,16 +5397,6 @@
 </w:ftr>
 </file>
 
-<file path=word/footer3.xml><?xml version="1.0" encoding="utf-8"?>
-<w:ftr xmlns:wpc="http://schemas.microsoft.com/office/word/2010/wordprocessingCanvas" xmlns:cx="http://schemas.microsoft.com/office/drawing/2014/chartex" xmlns:cx1="http://schemas.microsoft.com/office/drawing/2015/9/8/chartex" xmlns:cx2="http://schemas.microsoft.com/office/drawing/2015/10/21/chartex" xmlns:cx3="http://schemas.microsoft.com/office/drawing/2016/5/9/chartex" xmlns:cx4="http://schemas.microsoft.com/office/drawing/2016/5/10/chartex" xmlns:cx5="http://schemas.microsoft.com/office/drawing/2016/5/11/chartex" xmlns:cx6="http://schemas.microsoft.com/office/drawing/2016/5/12/chartex" xmlns:cx7="http://schemas.microsoft.com/office/drawing/2016/5/13/chartex" xmlns:cx8="http://schemas.microsoft.com/office/drawing/2016/5/14/chartex" xmlns:mc="http://schemas.openxmlformats.org/markup-compatibility/2006" xmlns:aink="http://schemas.microsoft.com/office/drawing/2016/ink" xmlns:am3d="http://schemas.microsoft.com/office/drawing/2017/model3d" xmlns:o="urn:schemas-microsoft-com:office:office" xmlns:oel="http://schemas.microsoft.com/office/2019/extlst" xmlns:r="http://schemas.openxmlformats.org/officeDocument/2006/relationships" xmlns:m="http://schemas.openxmlformats.org/officeDocument/2006/math" xmlns:v="urn:schemas-microsoft-com:vml" xmlns:wp14="http://schemas.microsoft.com/office/word/2010/wordprocessingDrawing" xmlns:wp="http://schemas.openxmlformats.org/drawingml/2006/wordprocessingDrawing" xmlns:w10="urn:schemas-microsoft-com:office:word" xmlns:w="http://schemas.openxmlformats.org/wordprocessingml/2006/main" xmlns:w14="http://schemas.microsoft.com/office/word/2010/wordml" xmlns:w15="http://schemas.microsoft.com/office/word/2012/wordml" xmlns:w16cex="http://schemas.microsoft.com/office/word/2018/wordml/cex" xmlns:w16cid="http://schemas.microsoft.com/office/word/2016/wordml/cid" xmlns:w16="http://schemas.microsoft.com/office/word/2018/wordml" xmlns:w16du="http://schemas.microsoft.com/office/word/2023/wordml/word16du" xmlns:w16sdtdh="http://schemas.microsoft.com/office/word/2020/wordml/sdtdatahash" xmlns:w16sdtfl="http://schemas.microsoft.com/office/word/2024/wordml/sdtformatlock" xmlns:w16se="http://schemas.microsoft.com/office/word/2015/wordml/symex" xmlns:wpg="http://schemas.microsoft.com/office/word/2010/wordprocessingGroup" xmlns:wpi="http://schemas.microsoft.com/office/word/2010/wordprocessingInk" xmlns:wne="http://schemas.microsoft.com/office/word/2006/wordml" xmlns:wps="http://schemas.microsoft.com/office/word/2010/wordprocessingShape" mc:Ignorable="w14 w15 w16se w16cid w16 w16cex w16sdtdh w16sdtfl w16du wp14">
-  <w:p>
-    <w:pPr>
-      <w:pStyle w:val="ae"/>
-    </w:pPr>
-  </w:p>
-</w:ftr>
-</file>
-
 <file path=word/footnotes.xml><?xml version="1.0" encoding="utf-8"?>
 <w:footnotes xmlns:wpc="http://schemas.microsoft.com/office/word/2010/wordprocessingCanvas" xmlns:cx="http://schemas.microsoft.com/office/drawing/2014/chartex" xmlns:cx1="http://schemas.microsoft.com/office/drawing/2015/9/8/chartex" xmlns:cx2="http://schemas.microsoft.com/office/drawing/2015/10/21/chartex" xmlns:cx3="http://schemas.microsoft.com/office/drawing/2016/5/9/chartex" xmlns:cx4="http://schemas.microsoft.com/office/drawing/2016/5/10/chartex" xmlns:cx5="http://schemas.microsoft.com/office/drawing/2016/5/11/chartex" xmlns:cx6="http://schemas.microsoft.com/office/drawing/2016/5/12/chartex" xmlns:cx7="http://schemas.microsoft.com/office/drawing/2016/5/13/chartex" xmlns:cx8="http://schemas.microsoft.com/office/drawing/2016/5/14/chartex" xmlns:mc="http://schemas.openxmlformats.org/markup-compatibility/2006" xmlns:aink="http://schemas.microsoft.com/office/drawing/2016/ink" xmlns:am3d="http://schemas.microsoft.com/office/drawing/2017/model3d" xmlns:o="urn:schemas-microsoft-com:office:office" xmlns:oel="http://schemas.microsoft.com/office/2019/extlst" xmlns:r="http://schemas.openxmlformats.org/officeDocument/2006/relationships" xmlns:m="http://schemas.openxmlformats.org/officeDocument/2006/math" xmlns:v="urn:schemas-microsoft-com:vml" xmlns:wp14="http://schemas.microsoft.com/office/word/2010/wordprocessingDrawing" xmlns:wp="http://schemas.openxmlformats.org/drawingml/2006/wordprocessingDrawing" xmlns:w10="urn:schemas-microsoft-com:office:word" xmlns:w="http://schemas.openxmlformats.org/wordprocessingml/2006/main" xmlns:w14="http://schemas.microsoft.com/office/word/2010/wordml" xmlns:w15="http://schemas.microsoft.com/office/word/2012/wordml" xmlns:w16cex="http://schemas.microsoft.com/office/word/2018/wordml/cex" xmlns:w16cid="http://schemas.microsoft.com/office/word/2016/wordml/cid" xmlns:w16="http://schemas.microsoft.com/office/word/2018/wordml" xmlns:w16du="http://schemas.microsoft.com/office/word/2023/wordml/word16du" xmlns:w16sdtdh="http://schemas.microsoft.com/office/word/2020/wordml/sdtdatahash" xmlns:w16sdtfl="http://schemas.microsoft.com/office/word/2024/wordml/sdtformatlock" xmlns:w16se="http://schemas.microsoft.com/office/word/2015/wordml/symex" xmlns:wpg="http://schemas.microsoft.com/office/word/2010/wordprocessingGroup" xmlns:wpi="http://schemas.microsoft.com/office/word/2010/wordprocessingInk" xmlns:wne="http://schemas.microsoft.com/office/word/2006/wordml" xmlns:wps="http://schemas.microsoft.com/office/word/2010/wordprocessingShape" mc:Ignorable="w14 w15 w16se w16cid w16 w16cex w16sdtdh w16sdtfl w16du wp14">
   <w:footnote w:type="separator" w:id="-1">
@@ -5428,16 +5417,6 @@
 </file>
 
 <file path=word/header1.xml><?xml version="1.0" encoding="utf-8"?>
-<w:hdr xmlns:wpc="http://schemas.microsoft.com/office/word/2010/wordprocessingCanvas" xmlns:cx="http://schemas.microsoft.com/office/drawing/2014/chartex" xmlns:cx1="http://schemas.microsoft.com/office/drawing/2015/9/8/chartex" xmlns:cx2="http://schemas.microsoft.com/office/drawing/2015/10/21/chartex" xmlns:cx3="http://schemas.microsoft.com/office/drawing/2016/5/9/chartex" xmlns:cx4="http://schemas.microsoft.com/office/drawing/2016/5/10/chartex" xmlns:cx5="http://schemas.microsoft.com/office/drawing/2016/5/11/chartex" xmlns:cx6="http://schemas.microsoft.com/office/drawing/2016/5/12/chartex" xmlns:cx7="http://schemas.microsoft.com/office/drawing/2016/5/13/chartex" xmlns:cx8="http://schemas.microsoft.com/office/drawing/2016/5/14/chartex" xmlns:mc="http://schemas.openxmlformats.org/markup-compatibility/2006" xmlns:aink="http://schemas.microsoft.com/office/drawing/2016/ink" xmlns:am3d="http://schemas.microsoft.com/office/drawing/2017/model3d" xmlns:o="urn:schemas-microsoft-com:office:office" xmlns:oel="http://schemas.microsoft.com/office/2019/extlst" xmlns:r="http://schemas.openxmlformats.org/officeDocument/2006/relationships" xmlns:m="http://schemas.openxmlformats.org/officeDocument/2006/math" xmlns:v="urn:schemas-microsoft-com:vml" xmlns:wp14="http://schemas.microsoft.com/office/word/2010/wordprocessingDrawing" xmlns:wp="http://schemas.openxmlformats.org/drawingml/2006/wordprocessingDrawing" xmlns:w10="urn:schemas-microsoft-com:office:word" xmlns:w="http://schemas.openxmlformats.org/wordprocessingml/2006/main" xmlns:w14="http://schemas.microsoft.com/office/word/2010/wordml" xmlns:w15="http://schemas.microsoft.com/office/word/2012/wordml" xmlns:w16cex="http://schemas.microsoft.com/office/word/2018/wordml/cex" xmlns:w16cid="http://schemas.microsoft.com/office/word/2016/wordml/cid" xmlns:w16="http://schemas.microsoft.com/office/word/2018/wordml" xmlns:w16du="http://schemas.microsoft.com/office/word/2023/wordml/word16du" xmlns:w16sdtdh="http://schemas.microsoft.com/office/word/2020/wordml/sdtdatahash" xmlns:w16sdtfl="http://schemas.microsoft.com/office/word/2024/wordml/sdtformatlock" xmlns:w16se="http://schemas.microsoft.com/office/word/2015/wordml/symex" xmlns:wpg="http://schemas.microsoft.com/office/word/2010/wordprocessingGroup" xmlns:wpi="http://schemas.microsoft.com/office/word/2010/wordprocessingInk" xmlns:wne="http://schemas.microsoft.com/office/word/2006/wordml" xmlns:wps="http://schemas.microsoft.com/office/word/2010/wordprocessingShape" mc:Ignorable="w14 w15 w16se w16cid w16 w16cex w16sdtdh w16sdtfl w16du wp14">
-  <w:p>
-    <w:pPr>
-      <w:pStyle w:val="ac"/>
-    </w:pPr>
-  </w:p>
-</w:hdr>
-</file>
-
-<file path=word/header2.xml><?xml version="1.0" encoding="utf-8"?>
 <w:hdr xmlns:wpc="http://schemas.microsoft.com/office/word/2010/wordprocessingCanvas" xmlns:cx="http://schemas.microsoft.com/office/drawing/2014/chartex" xmlns:cx1="http://schemas.microsoft.com/office/drawing/2015/9/8/chartex" xmlns:cx2="http://schemas.microsoft.com/office/drawing/2015/10/21/chartex" xmlns:cx3="http://schemas.microsoft.com/office/drawing/2016/5/9/chartex" xmlns:cx4="http://schemas.microsoft.com/office/drawing/2016/5/10/chartex" xmlns:cx5="http://schemas.microsoft.com/office/drawing/2016/5/11/chartex" xmlns:cx6="http://schemas.microsoft.com/office/drawing/2016/5/12/chartex" xmlns:cx7="http://schemas.microsoft.com/office/drawing/2016/5/13/chartex" xmlns:cx8="http://schemas.microsoft.com/office/drawing/2016/5/14/chartex" xmlns:mc="http://schemas.openxmlformats.org/markup-compatibility/2006" xmlns:aink="http://schemas.microsoft.com/office/drawing/2016/ink" xmlns:am3d="http://schemas.microsoft.com/office/drawing/2017/model3d" xmlns:o="urn:schemas-microsoft-com:office:office" xmlns:oel="http://schemas.microsoft.com/office/2019/extlst" xmlns:r="http://schemas.openxmlformats.org/officeDocument/2006/relationships" xmlns:m="http://schemas.openxmlformats.org/officeDocument/2006/math" xmlns:v="urn:schemas-microsoft-com:vml" xmlns:wp14="http://schemas.microsoft.com/office/word/2010/wordprocessingDrawing" xmlns:wp="http://schemas.openxmlformats.org/drawingml/2006/wordprocessingDrawing" xmlns:w10="urn:schemas-microsoft-com:office:word" xmlns:w="http://schemas.openxmlformats.org/wordprocessingml/2006/main" xmlns:w14="http://schemas.microsoft.com/office/word/2010/wordml" xmlns:w15="http://schemas.microsoft.com/office/word/2012/wordml" xmlns:w16cex="http://schemas.microsoft.com/office/word/2018/wordml/cex" xmlns:w16cid="http://schemas.microsoft.com/office/word/2016/wordml/cid" xmlns:w16="http://schemas.microsoft.com/office/word/2018/wordml" xmlns:w16du="http://schemas.microsoft.com/office/word/2023/wordml/word16du" xmlns:w16sdtdh="http://schemas.microsoft.com/office/word/2020/wordml/sdtdatahash" xmlns:w16sdtfl="http://schemas.microsoft.com/office/word/2024/wordml/sdtformatlock" xmlns:w16se="http://schemas.microsoft.com/office/word/2015/wordml/symex" xmlns:wpg="http://schemas.microsoft.com/office/word/2010/wordprocessingGroup" xmlns:wpi="http://schemas.microsoft.com/office/word/2010/wordprocessingInk" xmlns:wne="http://schemas.microsoft.com/office/word/2006/wordml" xmlns:wps="http://schemas.microsoft.com/office/word/2010/wordprocessingShape" mc:Ignorable="w14 w15 w16se w16cid w16 w16cex w16sdtdh w16sdtfl w16du wp14">
   <w:p>
     <w:pPr>
@@ -5451,16 +5430,6 @@
       </w:rPr>
       <w:t>คู่มือการใช้งานระบบยืม-คืนหนังสือ (Circulation Desk)</w:t>
     </w:r>
-  </w:p>
-</w:hdr>
-</file>
-
-<file path=word/header3.xml><?xml version="1.0" encoding="utf-8"?>
-<w:hdr xmlns:wpc="http://schemas.microsoft.com/office/word/2010/wordprocessingCanvas" xmlns:cx="http://schemas.microsoft.com/office/drawing/2014/chartex" xmlns:cx1="http://schemas.microsoft.com/office/drawing/2015/9/8/chartex" xmlns:cx2="http://schemas.microsoft.com/office/drawing/2015/10/21/chartex" xmlns:cx3="http://schemas.microsoft.com/office/drawing/2016/5/9/chartex" xmlns:cx4="http://schemas.microsoft.com/office/drawing/2016/5/10/chartex" xmlns:cx5="http://schemas.microsoft.com/office/drawing/2016/5/11/chartex" xmlns:cx6="http://schemas.microsoft.com/office/drawing/2016/5/12/chartex" xmlns:cx7="http://schemas.microsoft.com/office/drawing/2016/5/13/chartex" xmlns:cx8="http://schemas.microsoft.com/office/drawing/2016/5/14/chartex" xmlns:mc="http://schemas.openxmlformats.org/markup-compatibility/2006" xmlns:aink="http://schemas.microsoft.com/office/drawing/2016/ink" xmlns:am3d="http://schemas.microsoft.com/office/drawing/2017/model3d" xmlns:o="urn:schemas-microsoft-com:office:office" xmlns:oel="http://schemas.microsoft.com/office/2019/extlst" xmlns:r="http://schemas.openxmlformats.org/officeDocument/2006/relationships" xmlns:m="http://schemas.openxmlformats.org/officeDocument/2006/math" xmlns:v="urn:schemas-microsoft-com:vml" xmlns:wp14="http://schemas.microsoft.com/office/word/2010/wordprocessingDrawing" xmlns:wp="http://schemas.openxmlformats.org/drawingml/2006/wordprocessingDrawing" xmlns:w10="urn:schemas-microsoft-com:office:word" xmlns:w="http://schemas.openxmlformats.org/wordprocessingml/2006/main" xmlns:w14="http://schemas.microsoft.com/office/word/2010/wordml" xmlns:w15="http://schemas.microsoft.com/office/word/2012/wordml" xmlns:w16cex="http://schemas.microsoft.com/office/word/2018/wordml/cex" xmlns:w16cid="http://schemas.microsoft.com/office/word/2016/wordml/cid" xmlns:w16="http://schemas.microsoft.com/office/word/2018/wordml" xmlns:w16du="http://schemas.microsoft.com/office/word/2023/wordml/word16du" xmlns:w16sdtdh="http://schemas.microsoft.com/office/word/2020/wordml/sdtdatahash" xmlns:w16sdtfl="http://schemas.microsoft.com/office/word/2024/wordml/sdtformatlock" xmlns:w16se="http://schemas.microsoft.com/office/word/2015/wordml/symex" xmlns:wpg="http://schemas.microsoft.com/office/word/2010/wordprocessingGroup" xmlns:wpi="http://schemas.microsoft.com/office/word/2010/wordprocessingInk" xmlns:wne="http://schemas.microsoft.com/office/word/2006/wordml" xmlns:wps="http://schemas.microsoft.com/office/word/2010/wordprocessingShape" mc:Ignorable="w14 w15 w16se w16cid w16 w16cex w16sdtdh w16sdtfl w16du wp14">
-  <w:p>
-    <w:pPr>
-      <w:pStyle w:val="ac"/>
-    </w:pPr>
   </w:p>
 </w:hdr>
 </file>

</xml_diff>